<commit_message>
Update LATIHAN SOAL SBK BAB 1 - 2.docx
Update
</commit_message>
<xml_diff>
--- a/jasonpieterkwork/SBK/SEMESTER 1/LATIHAN SOAL SBK BAB 1 - 2.docx
+++ b/jasonpieterkwork/SBK/SEMESTER 1/LATIHAN SOAL SBK BAB 1 - 2.docx
@@ -1064,7 +1064,7 @@
           <w:rFonts w:ascii="Balsamiq Sans" w:hAnsi="Balsamiq Sans"/>
           <w:lang w:val="en-ID"/>
         </w:rPr>
-        <w:t>Pembangkit</w:t>
+        <w:t>Pembangki</w:t>
       </w:r>
       <w:proofErr w:type="spellEnd"/>
       <w:r>
@@ -1072,7 +1072,7 @@
           <w:rFonts w:ascii="Balsamiq Sans" w:hAnsi="Balsamiq Sans"/>
           <w:lang w:val="en-ID"/>
         </w:rPr>
-        <w:t xml:space="preserve"> Listrik Tenaga </w:t>
+        <w:t>t Listrik Tenaga</w:t>
       </w:r>
       <w:proofErr w:type="spellStart"/>
       <w:r>
@@ -1080,7 +1080,7 @@
           <w:rFonts w:ascii="Balsamiq Sans" w:hAnsi="Balsamiq Sans"/>
           <w:lang w:val="en-ID"/>
         </w:rPr>
-        <w:t>Sampah</w:t>
+        <w:t xml:space="preserve"> Sampa</w:t>
       </w:r>
       <w:proofErr w:type="spellEnd"/>
       <w:r>
@@ -1088,7 +1088,7 @@
           <w:rFonts w:ascii="Balsamiq Sans" w:hAnsi="Balsamiq Sans"/>
           <w:lang w:val="en-ID"/>
         </w:rPr>
-        <w:t xml:space="preserve"> </w:t>
+        <w:t>h</w:t>
       </w:r>
     </w:p>
     <w:p>
@@ -1228,76 +1228,76 @@
           <w:bCs/>
           <w:lang w:val="en-US"/>
         </w:rPr>
-        <w:t xml:space="preserve">4. </w:t>
-      </w:r>
-      <w:proofErr w:type="spellStart"/>
-      <w:r>
-        <w:rPr>
-          <w:rFonts w:ascii="Balsamiq Sans" w:hAnsi="Balsamiq Sans"/>
-          <w:b/>
-          <w:bCs/>
-          <w:lang w:val="en-US"/>
-        </w:rPr>
-        <w:t>Jelaskan</w:t>
-      </w:r>
-      <w:proofErr w:type="spellEnd"/>
-      <w:r>
-        <w:rPr>
-          <w:rFonts w:ascii="Balsamiq Sans" w:hAnsi="Balsamiq Sans"/>
-          <w:b/>
-          <w:bCs/>
-          <w:lang w:val="en-US"/>
-        </w:rPr>
-        <w:t xml:space="preserve"> </w:t>
-      </w:r>
-      <w:r>
-        <w:rPr>
-          <w:rFonts w:ascii="Balsamiq Sans" w:hAnsi="Balsamiq Sans"/>
-          <w:b/>
-          <w:bCs/>
-          <w:lang w:val="en-US"/>
-        </w:rPr>
-        <w:t xml:space="preserve">Yang Kamu </w:t>
-      </w:r>
-      <w:proofErr w:type="spellStart"/>
-      <w:r>
-        <w:rPr>
-          <w:rFonts w:ascii="Balsamiq Sans" w:hAnsi="Balsamiq Sans"/>
-          <w:b/>
-          <w:bCs/>
-          <w:lang w:val="en-US"/>
-        </w:rPr>
-        <w:t>Pahami</w:t>
-      </w:r>
-      <w:proofErr w:type="spellEnd"/>
-      <w:r>
-        <w:rPr>
-          <w:rFonts w:ascii="Balsamiq Sans" w:hAnsi="Balsamiq Sans"/>
-          <w:b/>
-          <w:bCs/>
-          <w:lang w:val="en-US"/>
-        </w:rPr>
-        <w:t xml:space="preserve"> </w:t>
-      </w:r>
-      <w:proofErr w:type="spellStart"/>
-      <w:r>
-        <w:rPr>
-          <w:rFonts w:ascii="Balsamiq Sans" w:hAnsi="Balsamiq Sans"/>
-          <w:b/>
-          <w:bCs/>
-          <w:lang w:val="en-US"/>
-        </w:rPr>
-        <w:t>Tentang</w:t>
-      </w:r>
-      <w:proofErr w:type="spellEnd"/>
-      <w:r>
-        <w:rPr>
-          <w:rFonts w:ascii="Balsamiq Sans" w:hAnsi="Balsamiq Sans"/>
-          <w:b/>
-          <w:bCs/>
-          <w:lang w:val="en-US"/>
-        </w:rPr>
-        <w:t xml:space="preserve">: </w:t>
+        <w:t>4.</w:t>
+      </w:r>
+      <w:proofErr w:type="spellStart"/>
+      <w:r>
+        <w:rPr>
+          <w:rFonts w:ascii="Balsamiq Sans" w:hAnsi="Balsamiq Sans"/>
+          <w:b/>
+          <w:bCs/>
+          <w:lang w:val="en-US"/>
+        </w:rPr>
+        <w:t xml:space="preserve"> Jelaska</w:t>
+      </w:r>
+      <w:proofErr w:type="spellEnd"/>
+      <w:r>
+        <w:rPr>
+          <w:rFonts w:ascii="Balsamiq Sans" w:hAnsi="Balsamiq Sans"/>
+          <w:b/>
+          <w:bCs/>
+          <w:lang w:val="en-US"/>
+        </w:rPr>
+        <w:t>n</w:t>
+      </w:r>
+      <w:r>
+        <w:rPr>
+          <w:rFonts w:ascii="Balsamiq Sans" w:hAnsi="Balsamiq Sans"/>
+          <w:b/>
+          <w:bCs/>
+          <w:lang w:val="en-US"/>
+        </w:rPr>
+        <w:t xml:space="preserve"> Yang Kamu</w:t>
+      </w:r>
+      <w:proofErr w:type="spellStart"/>
+      <w:r>
+        <w:rPr>
+          <w:rFonts w:ascii="Balsamiq Sans" w:hAnsi="Balsamiq Sans"/>
+          <w:b/>
+          <w:bCs/>
+          <w:lang w:val="en-US"/>
+        </w:rPr>
+        <w:t xml:space="preserve"> Paham</w:t>
+      </w:r>
+      <w:proofErr w:type="spellEnd"/>
+      <w:r>
+        <w:rPr>
+          <w:rFonts w:ascii="Balsamiq Sans" w:hAnsi="Balsamiq Sans"/>
+          <w:b/>
+          <w:bCs/>
+          <w:lang w:val="en-US"/>
+        </w:rPr>
+        <w:t>i</w:t>
+      </w:r>
+      <w:proofErr w:type="spellStart"/>
+      <w:r>
+        <w:rPr>
+          <w:rFonts w:ascii="Balsamiq Sans" w:hAnsi="Balsamiq Sans"/>
+          <w:b/>
+          <w:bCs/>
+          <w:lang w:val="en-US"/>
+        </w:rPr>
+        <w:t xml:space="preserve"> Tentan</w:t>
+      </w:r>
+      <w:proofErr w:type="spellEnd"/>
+      <w:r>
+        <w:rPr>
+          <w:rFonts w:ascii="Balsamiq Sans" w:hAnsi="Balsamiq Sans"/>
+          <w:b/>
+          <w:bCs/>
+          <w:lang w:val="en-US"/>
+        </w:rPr>
+        <w:t>g:</w:t>
       </w:r>
     </w:p>
     <w:p>
@@ -1398,7 +1398,7 @@
           <w:rFonts w:ascii="Balsamiq Sans" w:hAnsi="Balsamiq Sans"/>
           <w:lang w:val="en-US"/>
         </w:rPr>
-        <w:t>Dalma</w:t>
+        <w:t>Dalam</w:t>
       </w:r>
       <w:proofErr w:type="spellEnd"/>
       <w:r>
@@ -1741,226 +1741,225 @@
           <w:rFonts w:ascii="Balsamiq Sans" w:hAnsi="Balsamiq Sans"/>
           <w:lang w:val="en-US"/>
         </w:rPr>
-        <w:lastRenderedPageBreak/>
-        <w:t xml:space="preserve">Listrik </w:t>
-      </w:r>
-      <w:proofErr w:type="spellStart"/>
-      <w:r>
-        <w:rPr>
-          <w:rFonts w:ascii="Balsamiq Sans" w:hAnsi="Balsamiq Sans"/>
-          <w:lang w:val="en-US"/>
-        </w:rPr>
-        <w:t>Dinamis</w:t>
-      </w:r>
-      <w:proofErr w:type="spellEnd"/>
-      <w:r>
-        <w:rPr>
-          <w:rFonts w:ascii="Balsamiq Sans" w:hAnsi="Balsamiq Sans"/>
-          <w:lang w:val="en-US"/>
-        </w:rPr>
-        <w:t xml:space="preserve"> </w:t>
-      </w:r>
-      <w:proofErr w:type="spellStart"/>
-      <w:r>
-        <w:rPr>
-          <w:rFonts w:ascii="Balsamiq Sans" w:hAnsi="Balsamiq Sans"/>
-          <w:lang w:val="en-US"/>
-        </w:rPr>
-        <w:t>Adalah</w:t>
-      </w:r>
-      <w:proofErr w:type="spellEnd"/>
-      <w:r>
-        <w:rPr>
-          <w:rFonts w:ascii="Balsamiq Sans" w:hAnsi="Balsamiq Sans"/>
-          <w:lang w:val="en-US"/>
-        </w:rPr>
-        <w:t xml:space="preserve"> </w:t>
-      </w:r>
-      <w:proofErr w:type="spellStart"/>
-      <w:r>
-        <w:rPr>
-          <w:rFonts w:ascii="Balsamiq Sans" w:hAnsi="Balsamiq Sans"/>
-          <w:lang w:val="en-US"/>
-        </w:rPr>
-        <w:t>Muatan</w:t>
-      </w:r>
-      <w:proofErr w:type="spellEnd"/>
-      <w:r>
-        <w:rPr>
-          <w:rFonts w:ascii="Balsamiq Sans" w:hAnsi="Balsamiq Sans"/>
-          <w:lang w:val="en-US"/>
-        </w:rPr>
-        <w:t xml:space="preserve"> </w:t>
-      </w:r>
-      <w:r>
-        <w:rPr>
-          <w:rFonts w:ascii="Balsamiq Sans" w:hAnsi="Balsamiq Sans"/>
-          <w:lang w:val="en-US"/>
-        </w:rPr>
-        <w:t xml:space="preserve">Listrik </w:t>
-      </w:r>
-      <w:r>
-        <w:rPr>
-          <w:rFonts w:ascii="Balsamiq Sans" w:hAnsi="Balsamiq Sans"/>
-          <w:lang w:val="en-US"/>
-        </w:rPr>
-        <w:t xml:space="preserve">Yang Terus </w:t>
-      </w:r>
-      <w:proofErr w:type="spellStart"/>
-      <w:r>
-        <w:rPr>
-          <w:rFonts w:ascii="Balsamiq Sans" w:hAnsi="Balsamiq Sans"/>
-          <w:lang w:val="en-US"/>
-        </w:rPr>
-        <w:t>Bergerak</w:t>
-      </w:r>
-      <w:proofErr w:type="spellEnd"/>
-      <w:r>
-        <w:rPr>
-          <w:rFonts w:ascii="Balsamiq Sans" w:hAnsi="Balsamiq Sans"/>
-          <w:lang w:val="en-US"/>
-        </w:rPr>
-        <w:t xml:space="preserve">. </w:t>
-      </w:r>
-      <w:r>
-        <w:rPr>
-          <w:rFonts w:ascii="Balsamiq Sans" w:hAnsi="Balsamiq Sans"/>
-          <w:lang w:val="en-US"/>
-        </w:rPr>
-        <w:t xml:space="preserve">Listrik </w:t>
-      </w:r>
-      <w:proofErr w:type="spellStart"/>
-      <w:r>
-        <w:rPr>
-          <w:rFonts w:ascii="Balsamiq Sans" w:hAnsi="Balsamiq Sans"/>
-          <w:lang w:val="en-US"/>
-        </w:rPr>
-        <w:t>Dinamis</w:t>
-      </w:r>
-      <w:proofErr w:type="spellEnd"/>
-      <w:r>
-        <w:rPr>
-          <w:rFonts w:ascii="Balsamiq Sans" w:hAnsi="Balsamiq Sans"/>
-          <w:lang w:val="en-US"/>
-        </w:rPr>
-        <w:t xml:space="preserve"> </w:t>
-      </w:r>
-      <w:proofErr w:type="spellStart"/>
-      <w:r>
-        <w:rPr>
-          <w:rFonts w:ascii="Balsamiq Sans" w:hAnsi="Balsamiq Sans"/>
-          <w:lang w:val="en-US"/>
-        </w:rPr>
-        <w:t>Sering</w:t>
-      </w:r>
-      <w:proofErr w:type="spellEnd"/>
-      <w:r>
-        <w:rPr>
-          <w:rFonts w:ascii="Balsamiq Sans" w:hAnsi="Balsamiq Sans"/>
-          <w:lang w:val="en-US"/>
-        </w:rPr>
-        <w:t xml:space="preserve"> </w:t>
-      </w:r>
-      <w:proofErr w:type="spellStart"/>
-      <w:r>
-        <w:rPr>
-          <w:rFonts w:ascii="Balsamiq Sans" w:hAnsi="Balsamiq Sans"/>
-          <w:lang w:val="en-US"/>
-        </w:rPr>
-        <w:t>Disebut</w:t>
-      </w:r>
-      <w:proofErr w:type="spellEnd"/>
-      <w:r>
-        <w:rPr>
-          <w:rFonts w:ascii="Balsamiq Sans" w:hAnsi="Balsamiq Sans"/>
-          <w:lang w:val="en-US"/>
-        </w:rPr>
-        <w:t xml:space="preserve"> Juga </w:t>
-      </w:r>
-      <w:proofErr w:type="spellStart"/>
-      <w:r>
-        <w:rPr>
-          <w:rFonts w:ascii="Balsamiq Sans" w:hAnsi="Balsamiq Sans"/>
-          <w:lang w:val="en-US"/>
-        </w:rPr>
-        <w:t>Arus</w:t>
-      </w:r>
-      <w:proofErr w:type="spellEnd"/>
-      <w:r>
-        <w:rPr>
-          <w:rFonts w:ascii="Balsamiq Sans" w:hAnsi="Balsamiq Sans"/>
-          <w:lang w:val="en-US"/>
-        </w:rPr>
-        <w:t xml:space="preserve"> </w:t>
-      </w:r>
-      <w:r>
-        <w:rPr>
-          <w:rFonts w:ascii="Balsamiq Sans" w:hAnsi="Balsamiq Sans"/>
-          <w:lang w:val="en-US"/>
-        </w:rPr>
         <w:t>Listrik</w:t>
       </w:r>
-      <w:r>
-        <w:rPr>
-          <w:rFonts w:ascii="Balsamiq Sans" w:hAnsi="Balsamiq Sans"/>
-          <w:lang w:val="en-US"/>
-        </w:rPr>
-        <w:t xml:space="preserve">. </w:t>
-      </w:r>
-      <w:proofErr w:type="spellStart"/>
-      <w:r>
-        <w:rPr>
-          <w:rFonts w:ascii="Balsamiq Sans" w:hAnsi="Balsamiq Sans"/>
-          <w:lang w:val="en-US"/>
-        </w:rPr>
-        <w:t>Aliran</w:t>
-      </w:r>
-      <w:proofErr w:type="spellEnd"/>
-      <w:r>
-        <w:rPr>
-          <w:rFonts w:ascii="Balsamiq Sans" w:hAnsi="Balsamiq Sans"/>
-          <w:lang w:val="en-US"/>
-        </w:rPr>
-        <w:t xml:space="preserve"> </w:t>
-      </w:r>
-      <w:proofErr w:type="spellStart"/>
-      <w:r>
-        <w:rPr>
-          <w:rFonts w:ascii="Balsamiq Sans" w:hAnsi="Balsamiq Sans"/>
-          <w:lang w:val="en-US"/>
-        </w:rPr>
-        <w:t>Muatan</w:t>
-      </w:r>
-      <w:proofErr w:type="spellEnd"/>
-      <w:r>
-        <w:rPr>
-          <w:rFonts w:ascii="Balsamiq Sans" w:hAnsi="Balsamiq Sans"/>
-          <w:lang w:val="en-US"/>
-        </w:rPr>
-        <w:t xml:space="preserve"> </w:t>
-      </w:r>
-      <w:r>
-        <w:rPr>
-          <w:rFonts w:ascii="Balsamiq Sans" w:hAnsi="Balsamiq Sans"/>
-          <w:lang w:val="en-US"/>
-        </w:rPr>
-        <w:t xml:space="preserve">Listrik </w:t>
-      </w:r>
-      <w:proofErr w:type="spellStart"/>
-      <w:r>
-        <w:rPr>
-          <w:rFonts w:ascii="Balsamiq Sans" w:hAnsi="Balsamiq Sans"/>
-          <w:lang w:val="en-US"/>
-        </w:rPr>
-        <w:t>Terjadi</w:t>
-      </w:r>
-      <w:proofErr w:type="spellEnd"/>
-      <w:r>
-        <w:rPr>
-          <w:rFonts w:ascii="Balsamiq Sans" w:hAnsi="Balsamiq Sans"/>
-          <w:lang w:val="en-US"/>
-        </w:rPr>
-        <w:t xml:space="preserve"> </w:t>
+      <w:proofErr w:type="spellStart"/>
+      <w:r>
+        <w:rPr>
+          <w:rFonts w:ascii="Balsamiq Sans" w:hAnsi="Balsamiq Sans"/>
+          <w:lang w:val="en-US"/>
+        </w:rPr>
+        <w:t xml:space="preserve"> Dinami</w:t>
+      </w:r>
+      <w:proofErr w:type="spellEnd"/>
+      <w:r>
+        <w:rPr>
+          <w:rFonts w:ascii="Balsamiq Sans" w:hAnsi="Balsamiq Sans"/>
+          <w:lang w:val="en-US"/>
+        </w:rPr>
+        <w:t>s</w:t>
+      </w:r>
+      <w:proofErr w:type="spellStart"/>
+      <w:r>
+        <w:rPr>
+          <w:rFonts w:ascii="Balsamiq Sans" w:hAnsi="Balsamiq Sans"/>
+          <w:lang w:val="en-US"/>
+        </w:rPr>
+        <w:t xml:space="preserve"> Adala</w:t>
+      </w:r>
+      <w:proofErr w:type="spellEnd"/>
+      <w:r>
+        <w:rPr>
+          <w:rFonts w:ascii="Balsamiq Sans" w:hAnsi="Balsamiq Sans"/>
+          <w:lang w:val="en-US"/>
+        </w:rPr>
+        <w:t>h</w:t>
+      </w:r>
+      <w:proofErr w:type="spellStart"/>
+      <w:r>
+        <w:rPr>
+          <w:rFonts w:ascii="Balsamiq Sans" w:hAnsi="Balsamiq Sans"/>
+          <w:lang w:val="en-US"/>
+        </w:rPr>
+        <w:t xml:space="preserve"> Muata</w:t>
+      </w:r>
+      <w:proofErr w:type="spellEnd"/>
+      <w:r>
+        <w:rPr>
+          <w:rFonts w:ascii="Balsamiq Sans" w:hAnsi="Balsamiq Sans"/>
+          <w:lang w:val="en-US"/>
+        </w:rPr>
+        <w:t>n</w:t>
+      </w:r>
+      <w:r>
+        <w:rPr>
+          <w:rFonts w:ascii="Balsamiq Sans" w:hAnsi="Balsamiq Sans"/>
+          <w:lang w:val="en-US"/>
+        </w:rPr>
+        <w:t xml:space="preserve"> Listrik</w:t>
+      </w:r>
+      <w:r>
+        <w:rPr>
+          <w:rFonts w:ascii="Balsamiq Sans" w:hAnsi="Balsamiq Sans"/>
+          <w:lang w:val="en-US"/>
+        </w:rPr>
+        <w:t xml:space="preserve"> Yang Terus</w:t>
+      </w:r>
+      <w:proofErr w:type="spellStart"/>
+      <w:r>
+        <w:rPr>
+          <w:rFonts w:ascii="Balsamiq Sans" w:hAnsi="Balsamiq Sans"/>
+          <w:lang w:val="en-US"/>
+        </w:rPr>
+        <w:t xml:space="preserve"> Bergera</w:t>
+      </w:r>
+      <w:proofErr w:type="spellEnd"/>
+      <w:r>
+        <w:rPr>
+          <w:rFonts w:ascii="Balsamiq Sans" w:hAnsi="Balsamiq Sans"/>
+          <w:lang w:val="en-US"/>
+        </w:rPr>
+        <w:t>k.</w:t>
+      </w:r>
+      <w:r>
+        <w:rPr>
+          <w:rFonts w:ascii="Balsamiq Sans" w:hAnsi="Balsamiq Sans"/>
+          <w:lang w:val="en-US"/>
+        </w:rPr>
+        <w:t xml:space="preserve"> Listrik</w:t>
+      </w:r>
+      <w:proofErr w:type="spellStart"/>
+      <w:r>
+        <w:rPr>
+          <w:rFonts w:ascii="Balsamiq Sans" w:hAnsi="Balsamiq Sans"/>
+          <w:lang w:val="en-US"/>
+        </w:rPr>
+        <w:t xml:space="preserve"> Dinami</w:t>
+      </w:r>
+      <w:proofErr w:type="spellEnd"/>
+      <w:r>
+        <w:rPr>
+          <w:rFonts w:ascii="Balsamiq Sans" w:hAnsi="Balsamiq Sans"/>
+          <w:lang w:val="en-US"/>
+        </w:rPr>
+        <w:t>s</w:t>
+      </w:r>
+      <w:proofErr w:type="spellStart"/>
+      <w:r>
+        <w:rPr>
+          <w:rFonts w:ascii="Balsamiq Sans" w:hAnsi="Balsamiq Sans"/>
+          <w:lang w:val="en-US"/>
+        </w:rPr>
+        <w:t xml:space="preserve"> Serin</w:t>
+      </w:r>
+      <w:proofErr w:type="spellEnd"/>
+      <w:r>
+        <w:rPr>
+          <w:rFonts w:ascii="Balsamiq Sans" w:hAnsi="Balsamiq Sans"/>
+          <w:lang w:val="en-US"/>
+        </w:rPr>
+        <w:t>g</w:t>
+      </w:r>
+      <w:proofErr w:type="spellStart"/>
+      <w:r>
+        <w:rPr>
+          <w:rFonts w:ascii="Balsamiq Sans" w:hAnsi="Balsamiq Sans"/>
+          <w:lang w:val="en-US"/>
+        </w:rPr>
+        <w:t xml:space="preserve"> Disebu</w:t>
+      </w:r>
+      <w:proofErr w:type="spellEnd"/>
+      <w:r>
+        <w:rPr>
+          <w:rFonts w:ascii="Balsamiq Sans" w:hAnsi="Balsamiq Sans"/>
+          <w:lang w:val="en-US"/>
+        </w:rPr>
+        <w:t>t Juga</w:t>
+      </w:r>
+      <w:proofErr w:type="spellStart"/>
+      <w:r>
+        <w:rPr>
+          <w:rFonts w:ascii="Balsamiq Sans" w:hAnsi="Balsamiq Sans"/>
+          <w:lang w:val="en-US"/>
+        </w:rPr>
+        <w:t xml:space="preserve"> Aru</w:t>
+      </w:r>
+      <w:proofErr w:type="spellEnd"/>
+      <w:r>
+        <w:rPr>
+          <w:rFonts w:ascii="Balsamiq Sans" w:hAnsi="Balsamiq Sans"/>
+          <w:lang w:val="en-US"/>
+        </w:rPr>
+        <w:t>s</w:t>
+      </w:r>
+      <w:r>
+        <w:rPr>
+          <w:rFonts w:ascii="Balsamiq Sans" w:hAnsi="Balsamiq Sans"/>
+          <w:lang w:val="en-US"/>
+        </w:rPr>
+        <w:t xml:space="preserve"> Listri</w:t>
+      </w:r>
+      <w:r>
+        <w:rPr>
+          <w:rFonts w:ascii="Balsamiq Sans" w:hAnsi="Balsamiq Sans"/>
+          <w:lang w:val="en-US"/>
+        </w:rPr>
+        <w:t>k.</w:t>
+      </w:r>
+      <w:proofErr w:type="spellStart"/>
+      <w:r>
+        <w:rPr>
+          <w:rFonts w:ascii="Balsamiq Sans" w:hAnsi="Balsamiq Sans"/>
+          <w:lang w:val="en-US"/>
+        </w:rPr>
+        <w:t xml:space="preserve"> Alira</w:t>
+      </w:r>
+      <w:proofErr w:type="spellEnd"/>
+      <w:r>
+        <w:rPr>
+          <w:rFonts w:ascii="Balsamiq Sans" w:hAnsi="Balsamiq Sans"/>
+          <w:lang w:val="en-US"/>
+        </w:rPr>
+        <w:t>n</w:t>
+      </w:r>
+      <w:proofErr w:type="spellStart"/>
+      <w:r>
+        <w:rPr>
+          <w:rFonts w:ascii="Balsamiq Sans" w:hAnsi="Balsamiq Sans"/>
+          <w:lang w:val="en-US"/>
+        </w:rPr>
+        <w:t xml:space="preserve"> Muata</w:t>
+      </w:r>
+      <w:proofErr w:type="spellEnd"/>
+      <w:r>
+        <w:rPr>
+          <w:rFonts w:ascii="Balsamiq Sans" w:hAnsi="Balsamiq Sans"/>
+          <w:lang w:val="en-US"/>
+        </w:rPr>
+        <w:t>n</w:t>
+      </w:r>
+      <w:r>
+        <w:rPr>
+          <w:rFonts w:ascii="Balsamiq Sans" w:hAnsi="Balsamiq Sans"/>
+          <w:lang w:val="en-US"/>
+        </w:rPr>
+        <w:t xml:space="preserve"> Listrik</w:t>
+      </w:r>
+      <w:proofErr w:type="spellStart"/>
+      <w:r>
+        <w:rPr>
+          <w:rFonts w:ascii="Balsamiq Sans" w:hAnsi="Balsamiq Sans"/>
+          <w:lang w:val="en-US"/>
+        </w:rPr>
+        <w:t xml:space="preserve"> Terjad</w:t>
+      </w:r>
+      <w:proofErr w:type="spellEnd"/>
+      <w:r>
+        <w:rPr>
+          <w:rFonts w:ascii="Balsamiq Sans" w:hAnsi="Balsamiq Sans"/>
+          <w:lang w:val="en-US"/>
+        </w:rPr>
+        <w:t>i</w:t>
       </w:r>
       <w:proofErr w:type="gramStart"/>
       <w:r>
@@ -1968,7 +1967,7 @@
           <w:rFonts w:ascii="Balsamiq Sans" w:hAnsi="Balsamiq Sans"/>
           <w:lang w:val="en-US"/>
         </w:rPr>
-        <w:t>Di</w:t>
+        <w:t xml:space="preserve"> D</w:t>
       </w:r>
       <w:proofErr w:type="gramEnd"/>
       <w:r>
@@ -1976,347 +1975,347 @@
           <w:rFonts w:ascii="Balsamiq Sans" w:hAnsi="Balsamiq Sans"/>
           <w:lang w:val="en-US"/>
         </w:rPr>
-        <w:t xml:space="preserve"> </w:t>
-      </w:r>
-      <w:proofErr w:type="spellStart"/>
-      <w:r>
-        <w:rPr>
-          <w:rFonts w:ascii="Balsamiq Sans" w:hAnsi="Balsamiq Sans"/>
-          <w:lang w:val="en-US"/>
-        </w:rPr>
-        <w:t>Dalam</w:t>
-      </w:r>
-      <w:proofErr w:type="spellEnd"/>
-      <w:r>
-        <w:rPr>
-          <w:rFonts w:ascii="Balsamiq Sans" w:hAnsi="Balsamiq Sans"/>
-          <w:lang w:val="en-US"/>
-        </w:rPr>
-        <w:t xml:space="preserve"> </w:t>
-      </w:r>
-      <w:proofErr w:type="spellStart"/>
-      <w:r>
-        <w:rPr>
-          <w:rFonts w:ascii="Balsamiq Sans" w:hAnsi="Balsamiq Sans"/>
-          <w:lang w:val="en-US"/>
-        </w:rPr>
-        <w:t>Sebuah</w:t>
-      </w:r>
-      <w:proofErr w:type="spellEnd"/>
-      <w:r>
-        <w:rPr>
-          <w:rFonts w:ascii="Balsamiq Sans" w:hAnsi="Balsamiq Sans"/>
-          <w:lang w:val="en-US"/>
-        </w:rPr>
-        <w:t xml:space="preserve"> </w:t>
-      </w:r>
-      <w:proofErr w:type="spellStart"/>
-      <w:r>
-        <w:rPr>
-          <w:rFonts w:ascii="Balsamiq Sans" w:hAnsi="Balsamiq Sans"/>
-          <w:lang w:val="en-US"/>
-        </w:rPr>
-        <w:t>Penghantar</w:t>
-      </w:r>
-      <w:proofErr w:type="spellEnd"/>
-      <w:r>
-        <w:rPr>
-          <w:rFonts w:ascii="Balsamiq Sans" w:hAnsi="Balsamiq Sans"/>
-          <w:lang w:val="en-US"/>
-        </w:rPr>
-        <w:t xml:space="preserve">. </w:t>
-      </w:r>
-      <w:r>
-        <w:rPr>
-          <w:rFonts w:ascii="Balsamiq Sans" w:hAnsi="Balsamiq Sans"/>
-          <w:lang w:val="en-US"/>
-        </w:rPr>
-        <w:t xml:space="preserve">Listrik </w:t>
-      </w:r>
-      <w:proofErr w:type="spellStart"/>
-      <w:r>
-        <w:rPr>
-          <w:rFonts w:ascii="Balsamiq Sans" w:hAnsi="Balsamiq Sans"/>
-          <w:lang w:val="en-US"/>
-        </w:rPr>
-        <w:t>Dinamis</w:t>
-      </w:r>
-      <w:proofErr w:type="spellEnd"/>
-      <w:r>
-        <w:rPr>
-          <w:rFonts w:ascii="Balsamiq Sans" w:hAnsi="Balsamiq Sans"/>
-          <w:lang w:val="en-US"/>
-        </w:rPr>
-        <w:t xml:space="preserve"> Juga </w:t>
-      </w:r>
-      <w:proofErr w:type="spellStart"/>
-      <w:r>
-        <w:rPr>
-          <w:rFonts w:ascii="Balsamiq Sans" w:hAnsi="Balsamiq Sans"/>
-          <w:lang w:val="en-US"/>
-        </w:rPr>
-        <w:t>Hnaya</w:t>
-      </w:r>
-      <w:proofErr w:type="spellEnd"/>
-      <w:r>
-        <w:rPr>
-          <w:rFonts w:ascii="Balsamiq Sans" w:hAnsi="Balsamiq Sans"/>
-          <w:lang w:val="en-US"/>
-        </w:rPr>
-        <w:t xml:space="preserve"> </w:t>
-      </w:r>
-      <w:proofErr w:type="spellStart"/>
-      <w:r>
-        <w:rPr>
-          <w:rFonts w:ascii="Balsamiq Sans" w:hAnsi="Balsamiq Sans"/>
-          <w:lang w:val="en-US"/>
-        </w:rPr>
-        <w:t>Dapat</w:t>
-      </w:r>
-      <w:proofErr w:type="spellEnd"/>
-      <w:r>
-        <w:rPr>
-          <w:rFonts w:ascii="Balsamiq Sans" w:hAnsi="Balsamiq Sans"/>
-          <w:lang w:val="en-US"/>
-        </w:rPr>
-        <w:t xml:space="preserve"> </w:t>
-      </w:r>
-      <w:proofErr w:type="spellStart"/>
-      <w:r>
-        <w:rPr>
-          <w:rFonts w:ascii="Balsamiq Sans" w:hAnsi="Balsamiq Sans"/>
-          <w:lang w:val="en-US"/>
-        </w:rPr>
-        <w:t>Terjadi</w:t>
-      </w:r>
-      <w:proofErr w:type="spellEnd"/>
-      <w:r>
-        <w:rPr>
-          <w:rFonts w:ascii="Balsamiq Sans" w:hAnsi="Balsamiq Sans"/>
-          <w:lang w:val="en-US"/>
-        </w:rPr>
-        <w:t xml:space="preserve"> Pada </w:t>
-      </w:r>
-      <w:proofErr w:type="spellStart"/>
-      <w:r>
-        <w:rPr>
-          <w:rFonts w:ascii="Balsamiq Sans" w:hAnsi="Balsamiq Sans"/>
-          <w:lang w:val="en-US"/>
-        </w:rPr>
-        <w:t>Rangkaian</w:t>
-      </w:r>
-      <w:proofErr w:type="spellEnd"/>
-      <w:r>
-        <w:rPr>
-          <w:rFonts w:ascii="Balsamiq Sans" w:hAnsi="Balsamiq Sans"/>
-          <w:lang w:val="en-US"/>
-        </w:rPr>
-        <w:t xml:space="preserve"> </w:t>
-      </w:r>
-      <w:proofErr w:type="spellStart"/>
-      <w:r>
-        <w:rPr>
-          <w:rFonts w:ascii="Balsamiq Sans" w:hAnsi="Balsamiq Sans"/>
-          <w:lang w:val="en-US"/>
-        </w:rPr>
-        <w:t>Tertutup</w:t>
-      </w:r>
-      <w:proofErr w:type="spellEnd"/>
-      <w:r>
-        <w:rPr>
-          <w:rFonts w:ascii="Balsamiq Sans" w:hAnsi="Balsamiq Sans"/>
-          <w:lang w:val="en-US"/>
-        </w:rPr>
-        <w:t xml:space="preserve">. </w:t>
-      </w:r>
-      <w:r>
-        <w:rPr>
-          <w:rFonts w:ascii="Balsamiq Sans" w:hAnsi="Balsamiq Sans"/>
-          <w:lang w:val="en-US"/>
-        </w:rPr>
-        <w:t xml:space="preserve">Listrik </w:t>
-      </w:r>
-      <w:proofErr w:type="spellStart"/>
-      <w:r>
-        <w:rPr>
-          <w:rFonts w:ascii="Balsamiq Sans" w:hAnsi="Balsamiq Sans"/>
-          <w:lang w:val="en-US"/>
-        </w:rPr>
-        <w:t>Dinamis</w:t>
-      </w:r>
-      <w:proofErr w:type="spellEnd"/>
-      <w:r>
-        <w:rPr>
-          <w:rFonts w:ascii="Balsamiq Sans" w:hAnsi="Balsamiq Sans"/>
-          <w:lang w:val="en-US"/>
-        </w:rPr>
-        <w:t xml:space="preserve"> </w:t>
-      </w:r>
-      <w:proofErr w:type="spellStart"/>
-      <w:r>
-        <w:rPr>
-          <w:rFonts w:ascii="Balsamiq Sans" w:hAnsi="Balsamiq Sans"/>
-          <w:lang w:val="en-US"/>
-        </w:rPr>
-        <w:t>Dalam</w:t>
-      </w:r>
-      <w:proofErr w:type="spellEnd"/>
-      <w:r>
-        <w:rPr>
-          <w:rFonts w:ascii="Balsamiq Sans" w:hAnsi="Balsamiq Sans"/>
-          <w:lang w:val="en-US"/>
-        </w:rPr>
-        <w:t xml:space="preserve"> </w:t>
-      </w:r>
-      <w:proofErr w:type="spellStart"/>
-      <w:r>
-        <w:rPr>
-          <w:rFonts w:ascii="Balsamiq Sans" w:hAnsi="Balsamiq Sans"/>
-          <w:lang w:val="en-US"/>
-        </w:rPr>
-        <w:t>Kehidupan</w:t>
-      </w:r>
-      <w:proofErr w:type="spellEnd"/>
-      <w:r>
-        <w:rPr>
-          <w:rFonts w:ascii="Balsamiq Sans" w:hAnsi="Balsamiq Sans"/>
-          <w:lang w:val="en-US"/>
-        </w:rPr>
-        <w:t xml:space="preserve"> </w:t>
-      </w:r>
-      <w:proofErr w:type="spellStart"/>
-      <w:r>
-        <w:rPr>
-          <w:rFonts w:ascii="Balsamiq Sans" w:hAnsi="Balsamiq Sans"/>
-          <w:lang w:val="en-US"/>
-        </w:rPr>
-        <w:t>Sehari</w:t>
-      </w:r>
-      <w:proofErr w:type="spellEnd"/>
-      <w:r>
-        <w:rPr>
-          <w:rFonts w:ascii="Balsamiq Sans" w:hAnsi="Balsamiq Sans"/>
-          <w:lang w:val="en-US"/>
-        </w:rPr>
-        <w:t xml:space="preserve"> – Hari </w:t>
-      </w:r>
-      <w:proofErr w:type="spellStart"/>
-      <w:r>
-        <w:rPr>
-          <w:rFonts w:ascii="Balsamiq Sans" w:hAnsi="Balsamiq Sans"/>
-          <w:lang w:val="en-US"/>
-        </w:rPr>
-        <w:t>Digunakan</w:t>
-      </w:r>
-      <w:proofErr w:type="spellEnd"/>
-      <w:r>
-        <w:rPr>
-          <w:rFonts w:ascii="Balsamiq Sans" w:hAnsi="Balsamiq Sans"/>
-          <w:lang w:val="en-US"/>
-        </w:rPr>
-        <w:t xml:space="preserve"> </w:t>
-      </w:r>
-      <w:proofErr w:type="spellStart"/>
-      <w:r>
-        <w:rPr>
-          <w:rFonts w:ascii="Balsamiq Sans" w:hAnsi="Balsamiq Sans"/>
-          <w:lang w:val="en-US"/>
-        </w:rPr>
-        <w:t>Untuk</w:t>
-      </w:r>
-      <w:proofErr w:type="spellEnd"/>
-      <w:r>
-        <w:rPr>
-          <w:rFonts w:ascii="Balsamiq Sans" w:hAnsi="Balsamiq Sans"/>
-          <w:lang w:val="en-US"/>
-        </w:rPr>
-        <w:t xml:space="preserve"> </w:t>
-      </w:r>
-      <w:proofErr w:type="spellStart"/>
-      <w:r>
-        <w:rPr>
-          <w:rFonts w:ascii="Balsamiq Sans" w:hAnsi="Balsamiq Sans"/>
-          <w:lang w:val="en-US"/>
-        </w:rPr>
-        <w:t>Menyalakan</w:t>
-      </w:r>
-      <w:proofErr w:type="spellEnd"/>
-      <w:r>
-        <w:rPr>
-          <w:rFonts w:ascii="Balsamiq Sans" w:hAnsi="Balsamiq Sans"/>
-          <w:lang w:val="en-US"/>
-        </w:rPr>
-        <w:t xml:space="preserve"> </w:t>
-      </w:r>
-      <w:proofErr w:type="spellStart"/>
-      <w:r>
-        <w:rPr>
-          <w:rFonts w:ascii="Balsamiq Sans" w:hAnsi="Balsamiq Sans"/>
-          <w:lang w:val="en-US"/>
-        </w:rPr>
-        <w:t>Peralatan</w:t>
-      </w:r>
-      <w:proofErr w:type="spellEnd"/>
-      <w:r>
-        <w:rPr>
-          <w:rFonts w:ascii="Balsamiq Sans" w:hAnsi="Balsamiq Sans"/>
-          <w:lang w:val="en-US"/>
-        </w:rPr>
-        <w:t xml:space="preserve"> </w:t>
-      </w:r>
-      <w:r>
-        <w:rPr>
-          <w:rFonts w:ascii="Balsamiq Sans" w:hAnsi="Balsamiq Sans"/>
-          <w:lang w:val="en-US"/>
-        </w:rPr>
-        <w:t xml:space="preserve">Listrik </w:t>
-      </w:r>
-      <w:r>
-        <w:rPr>
-          <w:rFonts w:ascii="Balsamiq Sans" w:hAnsi="Balsamiq Sans"/>
-          <w:lang w:val="en-US"/>
-        </w:rPr>
-        <w:t xml:space="preserve">Pada </w:t>
-      </w:r>
-      <w:proofErr w:type="spellStart"/>
-      <w:r>
-        <w:rPr>
-          <w:rFonts w:ascii="Balsamiq Sans" w:hAnsi="Balsamiq Sans"/>
-          <w:lang w:val="en-US"/>
-        </w:rPr>
-        <w:t>Umumnya</w:t>
-      </w:r>
-      <w:proofErr w:type="spellEnd"/>
-      <w:r>
-        <w:rPr>
-          <w:rFonts w:ascii="Balsamiq Sans" w:hAnsi="Balsamiq Sans"/>
-          <w:lang w:val="en-US"/>
-        </w:rPr>
-        <w:t xml:space="preserve">. </w:t>
-      </w:r>
-      <w:proofErr w:type="spellStart"/>
-      <w:r>
-        <w:rPr>
-          <w:rFonts w:ascii="Balsamiq Sans" w:hAnsi="Balsamiq Sans"/>
-          <w:lang w:val="en-US"/>
-        </w:rPr>
-        <w:t>Contohnya</w:t>
-      </w:r>
-      <w:proofErr w:type="spellEnd"/>
-      <w:r>
-        <w:rPr>
-          <w:rFonts w:ascii="Balsamiq Sans" w:hAnsi="Balsamiq Sans"/>
-          <w:lang w:val="en-US"/>
-        </w:rPr>
-        <w:t xml:space="preserve">: Computer, </w:t>
-      </w:r>
-      <w:proofErr w:type="spellStart"/>
-      <w:r>
-        <w:rPr>
-          <w:rFonts w:ascii="Balsamiq Sans" w:hAnsi="Balsamiq Sans"/>
-          <w:lang w:val="en-US"/>
-        </w:rPr>
-        <w:t>Raidio</w:t>
+        <w:t>i</w:t>
+      </w:r>
+      <w:proofErr w:type="spellStart"/>
+      <w:r>
+        <w:rPr>
+          <w:rFonts w:ascii="Balsamiq Sans" w:hAnsi="Balsamiq Sans"/>
+          <w:lang w:val="en-US"/>
+        </w:rPr>
+        <w:t xml:space="preserve"> Dala</w:t>
+      </w:r>
+      <w:proofErr w:type="spellEnd"/>
+      <w:r>
+        <w:rPr>
+          <w:rFonts w:ascii="Balsamiq Sans" w:hAnsi="Balsamiq Sans"/>
+          <w:lang w:val="en-US"/>
+        </w:rPr>
+        <w:t>m</w:t>
+      </w:r>
+      <w:proofErr w:type="spellStart"/>
+      <w:r>
+        <w:rPr>
+          <w:rFonts w:ascii="Balsamiq Sans" w:hAnsi="Balsamiq Sans"/>
+          <w:lang w:val="en-US"/>
+        </w:rPr>
+        <w:t xml:space="preserve"> Sebua</w:t>
+      </w:r>
+      <w:proofErr w:type="spellEnd"/>
+      <w:r>
+        <w:rPr>
+          <w:rFonts w:ascii="Balsamiq Sans" w:hAnsi="Balsamiq Sans"/>
+          <w:lang w:val="en-US"/>
+        </w:rPr>
+        <w:t>h</w:t>
+      </w:r>
+      <w:proofErr w:type="spellStart"/>
+      <w:r>
+        <w:rPr>
+          <w:rFonts w:ascii="Balsamiq Sans" w:hAnsi="Balsamiq Sans"/>
+          <w:lang w:val="en-US"/>
+        </w:rPr>
+        <w:t xml:space="preserve"> Penghanta</w:t>
+      </w:r>
+      <w:proofErr w:type="spellEnd"/>
+      <w:r>
+        <w:rPr>
+          <w:rFonts w:ascii="Balsamiq Sans" w:hAnsi="Balsamiq Sans"/>
+          <w:lang w:val="en-US"/>
+        </w:rPr>
+        <w:t>r.</w:t>
+      </w:r>
+      <w:r>
+        <w:rPr>
+          <w:rFonts w:ascii="Balsamiq Sans" w:hAnsi="Balsamiq Sans"/>
+          <w:lang w:val="en-US"/>
+        </w:rPr>
+        <w:t xml:space="preserve"> Listrik</w:t>
+      </w:r>
+      <w:proofErr w:type="spellStart"/>
+      <w:r>
+        <w:rPr>
+          <w:rFonts w:ascii="Balsamiq Sans" w:hAnsi="Balsamiq Sans"/>
+          <w:lang w:val="en-US"/>
+        </w:rPr>
+        <w:t xml:space="preserve"> Dinami</w:t>
+      </w:r>
+      <w:proofErr w:type="spellEnd"/>
+      <w:r>
+        <w:rPr>
+          <w:rFonts w:ascii="Balsamiq Sans" w:hAnsi="Balsamiq Sans"/>
+          <w:lang w:val="en-US"/>
+        </w:rPr>
+        <w:t>s Juga</w:t>
+      </w:r>
+      <w:proofErr w:type="spellStart"/>
+      <w:r>
+        <w:rPr>
+          <w:rFonts w:ascii="Balsamiq Sans" w:hAnsi="Balsamiq Sans"/>
+          <w:lang w:val="en-US"/>
+        </w:rPr>
+        <w:t xml:space="preserve"> Hany</w:t>
+      </w:r>
+      <w:proofErr w:type="spellEnd"/>
+      <w:r>
+        <w:rPr>
+          <w:rFonts w:ascii="Balsamiq Sans" w:hAnsi="Balsamiq Sans"/>
+          <w:lang w:val="en-US"/>
+        </w:rPr>
+        <w:t>a</w:t>
+      </w:r>
+      <w:proofErr w:type="spellStart"/>
+      <w:r>
+        <w:rPr>
+          <w:rFonts w:ascii="Balsamiq Sans" w:hAnsi="Balsamiq Sans"/>
+          <w:lang w:val="en-US"/>
+        </w:rPr>
+        <w:t xml:space="preserve"> Dapa</w:t>
+      </w:r>
+      <w:proofErr w:type="spellEnd"/>
+      <w:r>
+        <w:rPr>
+          <w:rFonts w:ascii="Balsamiq Sans" w:hAnsi="Balsamiq Sans"/>
+          <w:lang w:val="en-US"/>
+        </w:rPr>
+        <w:t>t</w:t>
+      </w:r>
+      <w:proofErr w:type="spellStart"/>
+      <w:r>
+        <w:rPr>
+          <w:rFonts w:ascii="Balsamiq Sans" w:hAnsi="Balsamiq Sans"/>
+          <w:lang w:val="en-US"/>
+        </w:rPr>
+        <w:t xml:space="preserve"> Terjad</w:t>
+      </w:r>
+      <w:proofErr w:type="spellEnd"/>
+      <w:r>
+        <w:rPr>
+          <w:rFonts w:ascii="Balsamiq Sans" w:hAnsi="Balsamiq Sans"/>
+          <w:lang w:val="en-US"/>
+        </w:rPr>
+        <w:t>i Pada</w:t>
+      </w:r>
+      <w:proofErr w:type="spellStart"/>
+      <w:r>
+        <w:rPr>
+          <w:rFonts w:ascii="Balsamiq Sans" w:hAnsi="Balsamiq Sans"/>
+          <w:lang w:val="en-US"/>
+        </w:rPr>
+        <w:t xml:space="preserve"> Rangkaia</w:t>
+      </w:r>
+      <w:proofErr w:type="spellEnd"/>
+      <w:r>
+        <w:rPr>
+          <w:rFonts w:ascii="Balsamiq Sans" w:hAnsi="Balsamiq Sans"/>
+          <w:lang w:val="en-US"/>
+        </w:rPr>
+        <w:t>n</w:t>
+      </w:r>
+      <w:proofErr w:type="spellStart"/>
+      <w:r>
+        <w:rPr>
+          <w:rFonts w:ascii="Balsamiq Sans" w:hAnsi="Balsamiq Sans"/>
+          <w:lang w:val="en-US"/>
+        </w:rPr>
+        <w:t xml:space="preserve"> Tertutu</w:t>
+      </w:r>
+      <w:proofErr w:type="spellEnd"/>
+      <w:r>
+        <w:rPr>
+          <w:rFonts w:ascii="Balsamiq Sans" w:hAnsi="Balsamiq Sans"/>
+          <w:lang w:val="en-US"/>
+        </w:rPr>
+        <w:t>p.</w:t>
+      </w:r>
+      <w:r>
+        <w:rPr>
+          <w:rFonts w:ascii="Balsamiq Sans" w:hAnsi="Balsamiq Sans"/>
+          <w:lang w:val="en-US"/>
+        </w:rPr>
+        <w:t xml:space="preserve"> Listrik</w:t>
+      </w:r>
+      <w:proofErr w:type="spellStart"/>
+      <w:r>
+        <w:rPr>
+          <w:rFonts w:ascii="Balsamiq Sans" w:hAnsi="Balsamiq Sans"/>
+          <w:lang w:val="en-US"/>
+        </w:rPr>
+        <w:t xml:space="preserve"> Dinami</w:t>
+      </w:r>
+      <w:proofErr w:type="spellEnd"/>
+      <w:r>
+        <w:rPr>
+          <w:rFonts w:ascii="Balsamiq Sans" w:hAnsi="Balsamiq Sans"/>
+          <w:lang w:val="en-US"/>
+        </w:rPr>
+        <w:t>s</w:t>
+      </w:r>
+      <w:proofErr w:type="spellStart"/>
+      <w:r>
+        <w:rPr>
+          <w:rFonts w:ascii="Balsamiq Sans" w:hAnsi="Balsamiq Sans"/>
+          <w:lang w:val="en-US"/>
+        </w:rPr>
+        <w:t xml:space="preserve"> Dala</w:t>
+      </w:r>
+      <w:proofErr w:type="spellEnd"/>
+      <w:r>
+        <w:rPr>
+          <w:rFonts w:ascii="Balsamiq Sans" w:hAnsi="Balsamiq Sans"/>
+          <w:lang w:val="en-US"/>
+        </w:rPr>
+        <w:t>m</w:t>
+      </w:r>
+      <w:proofErr w:type="spellStart"/>
+      <w:r>
+        <w:rPr>
+          <w:rFonts w:ascii="Balsamiq Sans" w:hAnsi="Balsamiq Sans"/>
+          <w:lang w:val="en-US"/>
+        </w:rPr>
+        <w:t xml:space="preserve"> Kehidupa</w:t>
+      </w:r>
+      <w:proofErr w:type="spellEnd"/>
+      <w:r>
+        <w:rPr>
+          <w:rFonts w:ascii="Balsamiq Sans" w:hAnsi="Balsamiq Sans"/>
+          <w:lang w:val="en-US"/>
+        </w:rPr>
+        <w:t>n</w:t>
+      </w:r>
+      <w:proofErr w:type="spellStart"/>
+      <w:r>
+        <w:rPr>
+          <w:rFonts w:ascii="Balsamiq Sans" w:hAnsi="Balsamiq Sans"/>
+          <w:lang w:val="en-US"/>
+        </w:rPr>
+        <w:t xml:space="preserve"> Sehar</w:t>
+      </w:r>
+      <w:proofErr w:type="spellEnd"/>
+      <w:r>
+        <w:rPr>
+          <w:rFonts w:ascii="Balsamiq Sans" w:hAnsi="Balsamiq Sans"/>
+          <w:lang w:val="en-US"/>
+        </w:rPr>
+        <w:t>i – Hari</w:t>
+      </w:r>
+      <w:proofErr w:type="spellStart"/>
+      <w:r>
+        <w:rPr>
+          <w:rFonts w:ascii="Balsamiq Sans" w:hAnsi="Balsamiq Sans"/>
+          <w:lang w:val="en-US"/>
+        </w:rPr>
+        <w:t xml:space="preserve"> Digunaka</w:t>
+      </w:r>
+      <w:proofErr w:type="spellEnd"/>
+      <w:r>
+        <w:rPr>
+          <w:rFonts w:ascii="Balsamiq Sans" w:hAnsi="Balsamiq Sans"/>
+          <w:lang w:val="en-US"/>
+        </w:rPr>
+        <w:t>n</w:t>
+      </w:r>
+      <w:proofErr w:type="spellStart"/>
+      <w:r>
+        <w:rPr>
+          <w:rFonts w:ascii="Balsamiq Sans" w:hAnsi="Balsamiq Sans"/>
+          <w:lang w:val="en-US"/>
+        </w:rPr>
+        <w:t xml:space="preserve"> Untu</w:t>
+      </w:r>
+      <w:proofErr w:type="spellEnd"/>
+      <w:r>
+        <w:rPr>
+          <w:rFonts w:ascii="Balsamiq Sans" w:hAnsi="Balsamiq Sans"/>
+          <w:lang w:val="en-US"/>
+        </w:rPr>
+        <w:t>k</w:t>
+      </w:r>
+      <w:proofErr w:type="spellStart"/>
+      <w:r>
+        <w:rPr>
+          <w:rFonts w:ascii="Balsamiq Sans" w:hAnsi="Balsamiq Sans"/>
+          <w:lang w:val="en-US"/>
+        </w:rPr>
+        <w:t xml:space="preserve"> Menyalaka</w:t>
+      </w:r>
+      <w:proofErr w:type="spellEnd"/>
+      <w:r>
+        <w:rPr>
+          <w:rFonts w:ascii="Balsamiq Sans" w:hAnsi="Balsamiq Sans"/>
+          <w:lang w:val="en-US"/>
+        </w:rPr>
+        <w:t>n</w:t>
+      </w:r>
+      <w:proofErr w:type="spellStart"/>
+      <w:r>
+        <w:rPr>
+          <w:rFonts w:ascii="Balsamiq Sans" w:hAnsi="Balsamiq Sans"/>
+          <w:lang w:val="en-US"/>
+        </w:rPr>
+        <w:t xml:space="preserve"> Peralata</w:t>
+      </w:r>
+      <w:proofErr w:type="spellEnd"/>
+      <w:r>
+        <w:rPr>
+          <w:rFonts w:ascii="Balsamiq Sans" w:hAnsi="Balsamiq Sans"/>
+          <w:lang w:val="en-US"/>
+        </w:rPr>
+        <w:t>n</w:t>
+      </w:r>
+      <w:r>
+        <w:rPr>
+          <w:rFonts w:ascii="Balsamiq Sans" w:hAnsi="Balsamiq Sans"/>
+          <w:lang w:val="en-US"/>
+        </w:rPr>
+        <w:t xml:space="preserve"> Listrik</w:t>
+      </w:r>
+      <w:r>
+        <w:rPr>
+          <w:rFonts w:ascii="Balsamiq Sans" w:hAnsi="Balsamiq Sans"/>
+          <w:lang w:val="en-US"/>
+        </w:rPr>
+        <w:t xml:space="preserve"> Pada</w:t>
+      </w:r>
+      <w:proofErr w:type="spellStart"/>
+      <w:r>
+        <w:rPr>
+          <w:rFonts w:ascii="Balsamiq Sans" w:hAnsi="Balsamiq Sans"/>
+          <w:lang w:val="en-US"/>
+        </w:rPr>
+        <w:t xml:space="preserve"> Umumny</w:t>
+      </w:r>
+      <w:proofErr w:type="spellEnd"/>
+      <w:r>
+        <w:rPr>
+          <w:rFonts w:ascii="Balsamiq Sans" w:hAnsi="Balsamiq Sans"/>
+          <w:lang w:val="en-US"/>
+        </w:rPr>
+        <w:t>a.</w:t>
+      </w:r>
+      <w:proofErr w:type="spellStart"/>
+      <w:r>
+        <w:rPr>
+          <w:rFonts w:ascii="Balsamiq Sans" w:hAnsi="Balsamiq Sans"/>
+          <w:lang w:val="en-US"/>
+        </w:rPr>
+        <w:t xml:space="preserve"> Contohny</w:t>
+      </w:r>
+      <w:proofErr w:type="spellEnd"/>
+      <w:r>
+        <w:rPr>
+          <w:rFonts w:ascii="Balsamiq Sans" w:hAnsi="Balsamiq Sans"/>
+          <w:lang w:val="en-US"/>
+        </w:rPr>
+        <w:t>a: Computer,</w:t>
+      </w:r>
+      <w:proofErr w:type="spellStart"/>
+      <w:r>
+        <w:rPr>
+          <w:rFonts w:ascii="Balsamiq Sans" w:hAnsi="Balsamiq Sans"/>
+          <w:lang w:val="en-US"/>
+        </w:rPr>
+        <w:t xml:space="preserve"> Radio</w:t>
       </w:r>
       <w:proofErr w:type="spellEnd"/>
       <w:r>
@@ -2730,7 +2729,7 @@
           <w:rFonts w:ascii="Balsamiq Sans" w:hAnsi="Balsamiq Sans"/>
           <w:lang w:val="en-US"/>
         </w:rPr>
-        <w:t xml:space="preserve"> Tl</w:t>
+        <w:t xml:space="preserve"> TL</w:t>
       </w:r>
     </w:p>
     <w:p>
@@ -2754,7 +2753,7 @@
           <w:rFonts w:ascii="Balsamiq Sans" w:hAnsi="Balsamiq Sans"/>
           <w:lang w:val="en-US"/>
         </w:rPr>
-        <w:t>Sekelar</w:t>
+        <w:t>Sakelar</w:t>
       </w:r>
       <w:proofErr w:type="spellEnd"/>
       <w:r>
@@ -3584,168 +3583,167 @@
           <w:bCs/>
           <w:lang w:val="en-US"/>
         </w:rPr>
-        <w:lastRenderedPageBreak/>
-        <w:t xml:space="preserve">10. </w:t>
-      </w:r>
-      <w:proofErr w:type="spellStart"/>
-      <w:r>
-        <w:rPr>
-          <w:rFonts w:ascii="Balsamiq Sans" w:hAnsi="Balsamiq Sans"/>
-          <w:b/>
-          <w:bCs/>
-          <w:lang w:val="en-US"/>
-        </w:rPr>
-        <w:t>Untuk</w:t>
-      </w:r>
-      <w:proofErr w:type="spellEnd"/>
-      <w:r>
-        <w:rPr>
-          <w:rFonts w:ascii="Balsamiq Sans" w:hAnsi="Balsamiq Sans"/>
-          <w:b/>
-          <w:bCs/>
-          <w:lang w:val="en-US"/>
-        </w:rPr>
-        <w:t xml:space="preserve"> </w:t>
-      </w:r>
-      <w:proofErr w:type="spellStart"/>
-      <w:r>
-        <w:rPr>
-          <w:rFonts w:ascii="Balsamiq Sans" w:hAnsi="Balsamiq Sans"/>
-          <w:b/>
-          <w:bCs/>
-          <w:lang w:val="en-US"/>
-        </w:rPr>
-        <w:t>Membuat</w:t>
-      </w:r>
-      <w:proofErr w:type="spellEnd"/>
-      <w:r>
-        <w:rPr>
-          <w:rFonts w:ascii="Balsamiq Sans" w:hAnsi="Balsamiq Sans"/>
-          <w:b/>
-          <w:bCs/>
-          <w:lang w:val="en-US"/>
-        </w:rPr>
-        <w:t xml:space="preserve"> </w:t>
-      </w:r>
-      <w:proofErr w:type="spellStart"/>
-      <w:r>
-        <w:rPr>
-          <w:rFonts w:ascii="Balsamiq Sans" w:hAnsi="Balsamiq Sans"/>
-          <w:b/>
-          <w:bCs/>
-          <w:lang w:val="en-US"/>
-        </w:rPr>
-        <w:t>Sebuah</w:t>
-      </w:r>
-      <w:proofErr w:type="spellEnd"/>
-      <w:r>
-        <w:rPr>
-          <w:rFonts w:ascii="Balsamiq Sans" w:hAnsi="Balsamiq Sans"/>
-          <w:b/>
-          <w:bCs/>
-          <w:lang w:val="en-US"/>
-        </w:rPr>
-        <w:t xml:space="preserve"> Desain </w:t>
-      </w:r>
-      <w:proofErr w:type="spellStart"/>
-      <w:r>
-        <w:rPr>
-          <w:rFonts w:ascii="Balsamiq Sans" w:hAnsi="Balsamiq Sans"/>
-          <w:b/>
-          <w:bCs/>
-          <w:lang w:val="en-US"/>
-        </w:rPr>
-        <w:t>Instalasi</w:t>
-      </w:r>
-      <w:proofErr w:type="spellEnd"/>
-      <w:r>
-        <w:rPr>
-          <w:rFonts w:ascii="Balsamiq Sans" w:hAnsi="Balsamiq Sans"/>
-          <w:b/>
-          <w:bCs/>
-          <w:lang w:val="en-US"/>
-        </w:rPr>
-        <w:t xml:space="preserve"> </w:t>
-      </w:r>
-      <w:proofErr w:type="spellStart"/>
-      <w:r>
-        <w:rPr>
-          <w:rFonts w:ascii="Balsamiq Sans" w:hAnsi="Balsamiq Sans"/>
-          <w:b/>
-          <w:bCs/>
-          <w:lang w:val="en-US"/>
-        </w:rPr>
-        <w:t>Lampu</w:t>
-      </w:r>
-      <w:proofErr w:type="spellEnd"/>
-      <w:r>
-        <w:rPr>
-          <w:rFonts w:ascii="Balsamiq Sans" w:hAnsi="Balsamiq Sans"/>
-          <w:b/>
-          <w:bCs/>
-          <w:lang w:val="en-US"/>
-        </w:rPr>
-        <w:t xml:space="preserve"> Listrik, </w:t>
-      </w:r>
-      <w:proofErr w:type="spellStart"/>
-      <w:r>
-        <w:rPr>
-          <w:rFonts w:ascii="Balsamiq Sans" w:hAnsi="Balsamiq Sans"/>
-          <w:b/>
-          <w:bCs/>
-          <w:lang w:val="en-US"/>
-        </w:rPr>
-        <w:t>Terlebih</w:t>
-      </w:r>
-      <w:proofErr w:type="spellEnd"/>
-      <w:r>
-        <w:rPr>
-          <w:rFonts w:ascii="Balsamiq Sans" w:hAnsi="Balsamiq Sans"/>
-          <w:b/>
-          <w:bCs/>
-          <w:lang w:val="en-US"/>
-        </w:rPr>
-        <w:t xml:space="preserve"> </w:t>
-      </w:r>
-      <w:proofErr w:type="spellStart"/>
-      <w:r>
-        <w:rPr>
-          <w:rFonts w:ascii="Balsamiq Sans" w:hAnsi="Balsamiq Sans"/>
-          <w:b/>
-          <w:bCs/>
-          <w:lang w:val="en-US"/>
-        </w:rPr>
-        <w:t>Dahulu</w:t>
-      </w:r>
-      <w:proofErr w:type="spellEnd"/>
-      <w:r>
-        <w:rPr>
-          <w:rFonts w:ascii="Balsamiq Sans" w:hAnsi="Balsamiq Sans"/>
-          <w:b/>
-          <w:bCs/>
-          <w:lang w:val="en-US"/>
-        </w:rPr>
-        <w:t xml:space="preserve"> Kita </w:t>
-      </w:r>
-      <w:proofErr w:type="spellStart"/>
-      <w:r>
-        <w:rPr>
-          <w:rFonts w:ascii="Balsamiq Sans" w:hAnsi="Balsamiq Sans"/>
-          <w:b/>
-          <w:bCs/>
-          <w:lang w:val="en-US"/>
-        </w:rPr>
-        <w:t>Mempelajari</w:t>
-      </w:r>
-      <w:proofErr w:type="spellEnd"/>
-      <w:r>
-        <w:rPr>
-          <w:rFonts w:ascii="Balsamiq Sans" w:hAnsi="Balsamiq Sans"/>
-          <w:b/>
-          <w:bCs/>
-          <w:lang w:val="en-US"/>
-        </w:rPr>
-        <w:t xml:space="preserve"> </w:t>
+        <w:t>10.</w:t>
+      </w:r>
+      <w:proofErr w:type="spellStart"/>
+      <w:r>
+        <w:rPr>
+          <w:rFonts w:ascii="Balsamiq Sans" w:hAnsi="Balsamiq Sans"/>
+          <w:b/>
+          <w:bCs/>
+          <w:lang w:val="en-US"/>
+        </w:rPr>
+        <w:t xml:space="preserve"> Untu</w:t>
+      </w:r>
+      <w:proofErr w:type="spellEnd"/>
+      <w:r>
+        <w:rPr>
+          <w:rFonts w:ascii="Balsamiq Sans" w:hAnsi="Balsamiq Sans"/>
+          <w:b/>
+          <w:bCs/>
+          <w:lang w:val="en-US"/>
+        </w:rPr>
+        <w:t>k</w:t>
+      </w:r>
+      <w:proofErr w:type="spellStart"/>
+      <w:r>
+        <w:rPr>
+          <w:rFonts w:ascii="Balsamiq Sans" w:hAnsi="Balsamiq Sans"/>
+          <w:b/>
+          <w:bCs/>
+          <w:lang w:val="en-US"/>
+        </w:rPr>
+        <w:t xml:space="preserve"> Membua</w:t>
+      </w:r>
+      <w:proofErr w:type="spellEnd"/>
+      <w:r>
+        <w:rPr>
+          <w:rFonts w:ascii="Balsamiq Sans" w:hAnsi="Balsamiq Sans"/>
+          <w:b/>
+          <w:bCs/>
+          <w:lang w:val="en-US"/>
+        </w:rPr>
+        <w:t>t</w:t>
+      </w:r>
+      <w:proofErr w:type="spellStart"/>
+      <w:r>
+        <w:rPr>
+          <w:rFonts w:ascii="Balsamiq Sans" w:hAnsi="Balsamiq Sans"/>
+          <w:b/>
+          <w:bCs/>
+          <w:lang w:val="en-US"/>
+        </w:rPr>
+        <w:t xml:space="preserve"> Sebua</w:t>
+      </w:r>
+      <w:proofErr w:type="spellEnd"/>
+      <w:r>
+        <w:rPr>
+          <w:rFonts w:ascii="Balsamiq Sans" w:hAnsi="Balsamiq Sans"/>
+          <w:b/>
+          <w:bCs/>
+          <w:lang w:val="en-US"/>
+        </w:rPr>
+        <w:t>h Desain</w:t>
+      </w:r>
+      <w:proofErr w:type="spellStart"/>
+      <w:r>
+        <w:rPr>
+          <w:rFonts w:ascii="Balsamiq Sans" w:hAnsi="Balsamiq Sans"/>
+          <w:b/>
+          <w:bCs/>
+          <w:lang w:val="en-US"/>
+        </w:rPr>
+        <w:t xml:space="preserve"> Instalas</w:t>
+      </w:r>
+      <w:proofErr w:type="spellEnd"/>
+      <w:r>
+        <w:rPr>
+          <w:rFonts w:ascii="Balsamiq Sans" w:hAnsi="Balsamiq Sans"/>
+          <w:b/>
+          <w:bCs/>
+          <w:lang w:val="en-US"/>
+        </w:rPr>
+        <w:t>i</w:t>
+      </w:r>
+      <w:proofErr w:type="spellStart"/>
+      <w:r>
+        <w:rPr>
+          <w:rFonts w:ascii="Balsamiq Sans" w:hAnsi="Balsamiq Sans"/>
+          <w:b/>
+          <w:bCs/>
+          <w:lang w:val="en-US"/>
+        </w:rPr>
+        <w:t xml:space="preserve"> Lamp</w:t>
+      </w:r>
+      <w:proofErr w:type="spellEnd"/>
+      <w:r>
+        <w:rPr>
+          <w:rFonts w:ascii="Balsamiq Sans" w:hAnsi="Balsamiq Sans"/>
+          <w:b/>
+          <w:bCs/>
+          <w:lang w:val="en-US"/>
+        </w:rPr>
+        <w:t>u Listrik,</w:t>
+      </w:r>
+      <w:proofErr w:type="spellStart"/>
+      <w:r>
+        <w:rPr>
+          <w:rFonts w:ascii="Balsamiq Sans" w:hAnsi="Balsamiq Sans"/>
+          <w:b/>
+          <w:bCs/>
+          <w:lang w:val="en-US"/>
+        </w:rPr>
+        <w:t xml:space="preserve"> Terlebi</w:t>
+      </w:r>
+      <w:proofErr w:type="spellEnd"/>
+      <w:r>
+        <w:rPr>
+          <w:rFonts w:ascii="Balsamiq Sans" w:hAnsi="Balsamiq Sans"/>
+          <w:b/>
+          <w:bCs/>
+          <w:lang w:val="en-US"/>
+        </w:rPr>
+        <w:t>h</w:t>
+      </w:r>
+      <w:proofErr w:type="spellStart"/>
+      <w:r>
+        <w:rPr>
+          <w:rFonts w:ascii="Balsamiq Sans" w:hAnsi="Balsamiq Sans"/>
+          <w:b/>
+          <w:bCs/>
+          <w:lang w:val="en-US"/>
+        </w:rPr>
+        <w:t xml:space="preserve"> Dahul</w:t>
+      </w:r>
+      <w:proofErr w:type="spellEnd"/>
+      <w:r>
+        <w:rPr>
+          <w:rFonts w:ascii="Balsamiq Sans" w:hAnsi="Balsamiq Sans"/>
+          <w:b/>
+          <w:bCs/>
+          <w:lang w:val="en-US"/>
+        </w:rPr>
+        <w:t>u Kita</w:t>
+      </w:r>
+      <w:proofErr w:type="spellStart"/>
+      <w:r>
+        <w:rPr>
+          <w:rFonts w:ascii="Balsamiq Sans" w:hAnsi="Balsamiq Sans"/>
+          <w:b/>
+          <w:bCs/>
+          <w:lang w:val="en-US"/>
+        </w:rPr>
+        <w:t xml:space="preserve"> Mempelajar</w:t>
+      </w:r>
+      <w:proofErr w:type="spellEnd"/>
+      <w:r>
+        <w:rPr>
+          <w:rFonts w:ascii="Balsamiq Sans" w:hAnsi="Balsamiq Sans"/>
+          <w:b/>
+          <w:bCs/>
+          <w:lang w:val="en-US"/>
+        </w:rPr>
+        <w:t>i</w:t>
       </w:r>
     </w:p>
     <w:p>
@@ -3823,7 +3821,7 @@
           <w:rFonts w:ascii="Balsamiq Sans" w:hAnsi="Balsamiq Sans"/>
           <w:lang w:val="en-ID"/>
         </w:rPr>
-        <w:t xml:space="preserve">, Gambar </w:t>
+        <w:t>, Gambar I</w:t>
       </w:r>
       <w:proofErr w:type="spellStart"/>
       <w:r>
@@ -3831,7 +3829,7 @@
           <w:rFonts w:ascii="Balsamiq Sans" w:hAnsi="Balsamiq Sans"/>
           <w:lang w:val="en-ID"/>
         </w:rPr>
-        <w:t>Instalasi</w:t>
+        <w:t xml:space="preserve">nstalasi </w:t>
       </w:r>
       <w:proofErr w:type="spellEnd"/>
       <w:r>
@@ -3839,7 +3837,7 @@
           <w:rFonts w:ascii="Balsamiq Sans" w:hAnsi="Balsamiq Sans"/>
           <w:lang w:val="en-ID"/>
         </w:rPr>
-        <w:t xml:space="preserve"> Listrik Dan </w:t>
+        <w:t>Listrik Dan S</w:t>
       </w:r>
       <w:proofErr w:type="spellStart"/>
       <w:r>
@@ -3847,7 +3845,7 @@
           <w:rFonts w:ascii="Balsamiq Sans" w:hAnsi="Balsamiq Sans"/>
           <w:lang w:val="en-ID"/>
         </w:rPr>
-        <w:t>Simbol-Simbol</w:t>
+        <w:t>imbol – Simbo</w:t>
       </w:r>
       <w:proofErr w:type="spellEnd"/>
       <w:r>
@@ -3855,7 +3853,7 @@
           <w:rFonts w:ascii="Balsamiq Sans" w:hAnsi="Balsamiq Sans"/>
           <w:lang w:val="en-ID"/>
         </w:rPr>
-        <w:t xml:space="preserve"> Listrik.</w:t>
+        <w:t>l Listrik.</w:t>
       </w:r>
     </w:p>
     <w:p>

</xml_diff>